<commit_message>
feat: update Milestone 3 report and progress review documents with detailed API and testing information
</commit_message>
<xml_diff>
--- a/submission/milestone-3/MAY2026-Team-021-Milestone-3-Report.docx
+++ b/submission/milestone-3/MAY2026-Team-021-Milestone-3-Report.docx
@@ -35,7 +35,7 @@
       </w:pPr>
       <w:r>
         <w:rPr/>
-        <w:t>API Sprint 1 Consolidated Report</w:t>
+        <w:t>Milestone 3 - API Sprint 1 Consolidated Report</w:t>
       </w:r>
     </w:p>
     <w:p>
@@ -65,7 +65,18 @@
       </w:r>
       <w:r>
         <w:rPr/>
-        <w:t xml:space="preserve"> Smart Library Management System</w:t>
+        <w:t xml:space="preserve"> Library Management System for Study Libraries</w:t>
+        <w:br/>
+      </w:r>
+      <w:r>
+        <w:rPr>
+          <w:rStyle w:val="Strong"/>
+        </w:rPr>
+        <w:t>Product:</w:t>
+      </w:r>
+      <w:r>
+        <w:rPr/>
+        <w:t xml:space="preserve"> Smart Library App</w:t>
         <w:br/>
       </w:r>
       <w:r>
@@ -241,7 +252,7 @@
       </w:pPr>
       <w:r>
         <w:rPr/>
-        <w:t xml:space="preserve">Sprint 1 replaced the frontend-only mock foundation with working FastAPI, SQLAlchemy, JWT, tenant isolation, and PostgreSQL-compatible domain APIs. The result is an integrated owner workflow for registering a library, managing students and physical resources, allocating seats, recording fees, publishing announcements, and viewing operational reports. </w:t>
+        <w:t xml:space="preserve">Milestone 3 API Sprint 1 (Project Sprint 7) replaced the frontend-only mock foundation with working FastAPI, SQLAlchemy, JWT, tenant isolation, and PostgreSQL-compatible domain APIs. The result is an integrated owner workflow for registering a library, managing students and physical resources, allocating seats, recording fees, publishing announcements, and viewing operational reports. </w:t>
       </w:r>
     </w:p>
     <w:p>
@@ -324,6 +335,435 @@
         <w:t>backend test modules</w:t>
       </w:r>
     </w:p>
+    <w:p>
+      <w:pPr>
+        <w:pStyle w:val="Heading3"/>
+        <w:bidi w:val="0"/>
+        <w:jc w:val="start"/>
+        <w:rPr/>
+      </w:pPr>
+      <w:r>
+        <w:rPr/>
+        <w:t>Continuity from Milestones 1 and 2</w:t>
+      </w:r>
+    </w:p>
+    <w:p>
+      <w:pPr>
+        <w:pStyle w:val="BodyText"/>
+        <w:bidi w:val="0"/>
+        <w:jc w:val="start"/>
+        <w:rPr/>
+      </w:pPr>
+      <w:r>
+        <w:rPr/>
+        <w:t xml:space="preserve">Milestone 1 identified Library Owners/Managers as primary users and documented their need for secure access, digital student records, shift-aware seats, conflict-free allocations, fees, receipts, reminders, and reports. Milestone 2 translated those needs into Vue, Pinia, service, FastAPI, repository, and database components. This sprint implemented and tested the backend contracts behind that design. </w:t>
+      </w:r>
+    </w:p>
+    <w:tbl>
+      <w:tblPr>
+        <w:tblW w:w="13635" w:type="dxa"/>
+        <w:jc w:val="start"/>
+        <w:tblInd w:w="0" w:type="dxa"/>
+        <w:tblLayout w:type="fixed"/>
+        <w:tblCellMar>
+          <w:top w:w="28" w:type="dxa"/>
+          <w:start w:w="28" w:type="dxa"/>
+          <w:bottom w:w="28" w:type="dxa"/>
+          <w:end w:w="28" w:type="dxa"/>
+        </w:tblCellMar>
+      </w:tblPr>
+      <w:tblGrid>
+        <w:gridCol w:w="3899"/>
+        <w:gridCol w:w="4279"/>
+        <w:gridCol w:w="5457"/>
+      </w:tblGrid>
+      <w:tr>
+        <w:trPr>
+          <w:tblHeader w:val="true"/>
+        </w:trPr>
+        <w:tc>
+          <w:tcPr>
+            <w:tcW w:w="3899" w:type="dxa"/>
+            <w:tcBorders/>
+            <w:vAlign w:val="center"/>
+          </w:tcPr>
+          <w:p>
+            <w:pPr>
+              <w:pStyle w:val="TableHeading"/>
+              <w:suppressLineNumbers/>
+              <w:shd w:fill="EAF1FB" w:val="clear"/>
+              <w:bidi w:val="0"/>
+              <w:spacing w:before="0" w:after="135"/>
+              <w:jc w:val="start"/>
+              <w:rPr/>
+            </w:pPr>
+            <w:r>
+              <w:rPr/>
+              <w:t>Milestone 1 need</w:t>
+            </w:r>
+          </w:p>
+        </w:tc>
+        <w:tc>
+          <w:tcPr>
+            <w:tcW w:w="4279" w:type="dxa"/>
+            <w:tcBorders/>
+            <w:vAlign w:val="center"/>
+          </w:tcPr>
+          <w:p>
+            <w:pPr>
+              <w:pStyle w:val="TableHeading"/>
+              <w:suppressLineNumbers/>
+              <w:shd w:fill="EAF1FB" w:val="clear"/>
+              <w:bidi w:val="0"/>
+              <w:spacing w:before="0" w:after="135"/>
+              <w:jc w:val="start"/>
+              <w:rPr/>
+            </w:pPr>
+            <w:r>
+              <w:rPr/>
+              <w:t>Milestone 2 design</w:t>
+            </w:r>
+          </w:p>
+        </w:tc>
+        <w:tc>
+          <w:tcPr>
+            <w:tcW w:w="5457" w:type="dxa"/>
+            <w:tcBorders/>
+            <w:vAlign w:val="center"/>
+          </w:tcPr>
+          <w:p>
+            <w:pPr>
+              <w:pStyle w:val="TableHeading"/>
+              <w:suppressLineNumbers/>
+              <w:shd w:fill="EAF1FB" w:val="clear"/>
+              <w:bidi w:val="0"/>
+              <w:spacing w:before="0" w:after="135"/>
+              <w:jc w:val="start"/>
+              <w:rPr/>
+            </w:pPr>
+            <w:r>
+              <w:rPr/>
+              <w:t>Milestone 3 evidence</w:t>
+            </w:r>
+          </w:p>
+        </w:tc>
+      </w:tr>
+      <w:tr>
+        <w:trPr/>
+        <w:tc>
+          <w:tcPr>
+            <w:tcW w:w="3899" w:type="dxa"/>
+            <w:tcBorders/>
+            <w:vAlign w:val="center"/>
+          </w:tcPr>
+          <w:p>
+            <w:pPr>
+              <w:pStyle w:val="TableContents"/>
+              <w:bidi w:val="0"/>
+              <w:spacing w:before="0" w:after="135"/>
+              <w:jc w:val="start"/>
+              <w:rPr/>
+            </w:pPr>
+            <w:r>
+              <w:rPr/>
+              <w:t>Library registration and secure login</w:t>
+            </w:r>
+          </w:p>
+        </w:tc>
+        <w:tc>
+          <w:tcPr>
+            <w:tcW w:w="4279" w:type="dxa"/>
+            <w:tcBorders/>
+            <w:vAlign w:val="center"/>
+          </w:tcPr>
+          <w:p>
+            <w:pPr>
+              <w:pStyle w:val="TableContents"/>
+              <w:bidi w:val="0"/>
+              <w:spacing w:before="0" w:after="135"/>
+              <w:jc w:val="start"/>
+              <w:rPr/>
+            </w:pPr>
+            <w:r>
+              <w:rPr/>
+              <w:t>Authentication and library-registration components</w:t>
+            </w:r>
+          </w:p>
+        </w:tc>
+        <w:tc>
+          <w:tcPr>
+            <w:tcW w:w="5457" w:type="dxa"/>
+            <w:tcBorders/>
+            <w:vAlign w:val="center"/>
+          </w:tcPr>
+          <w:p>
+            <w:pPr>
+              <w:pStyle w:val="TableContents"/>
+              <w:bidi w:val="0"/>
+              <w:spacing w:before="0" w:after="135"/>
+              <w:jc w:val="start"/>
+              <w:rPr/>
+            </w:pPr>
+            <w:r>
+              <w:rPr/>
+              <w:t>13 authentication operations, JWT session tests, and library bootstrap test</w:t>
+            </w:r>
+          </w:p>
+        </w:tc>
+      </w:tr>
+      <w:tr>
+        <w:trPr/>
+        <w:tc>
+          <w:tcPr>
+            <w:tcW w:w="3899" w:type="dxa"/>
+            <w:tcBorders/>
+            <w:vAlign w:val="center"/>
+          </w:tcPr>
+          <w:p>
+            <w:pPr>
+              <w:pStyle w:val="TableContents"/>
+              <w:bidi w:val="0"/>
+              <w:spacing w:before="0" w:after="135"/>
+              <w:jc w:val="start"/>
+              <w:rPr/>
+            </w:pPr>
+            <w:r>
+              <w:rPr/>
+              <w:t>Students, shifts, seat visibility, and conflict prevention</w:t>
+            </w:r>
+          </w:p>
+        </w:tc>
+        <w:tc>
+          <w:tcPr>
+            <w:tcW w:w="4279" w:type="dxa"/>
+            <w:tcBorders/>
+            <w:vAlign w:val="center"/>
+          </w:tcPr>
+          <w:p>
+            <w:pPr>
+              <w:pStyle w:val="TableContents"/>
+              <w:bidi w:val="0"/>
+              <w:spacing w:before="0" w:after="135"/>
+              <w:jc w:val="start"/>
+              <w:rPr/>
+            </w:pPr>
+            <w:r>
+              <w:rPr/>
+              <w:t>Core library, seat availability, and allocation components</w:t>
+            </w:r>
+          </w:p>
+        </w:tc>
+        <w:tc>
+          <w:tcPr>
+            <w:tcW w:w="5457" w:type="dxa"/>
+            <w:tcBorders/>
+            <w:vAlign w:val="center"/>
+          </w:tcPr>
+          <w:p>
+            <w:pPr>
+              <w:pStyle w:val="TableContents"/>
+              <w:bidi w:val="0"/>
+              <w:spacing w:before="0" w:after="135"/>
+              <w:jc w:val="start"/>
+              <w:rPr/>
+            </w:pPr>
+            <w:r>
+              <w:rPr/>
+              <w:t>32 student/floor/seat/shift/allocation operations with overlap and tenant tests</w:t>
+            </w:r>
+          </w:p>
+        </w:tc>
+      </w:tr>
+      <w:tr>
+        <w:trPr/>
+        <w:tc>
+          <w:tcPr>
+            <w:tcW w:w="3899" w:type="dxa"/>
+            <w:tcBorders/>
+            <w:vAlign w:val="center"/>
+          </w:tcPr>
+          <w:p>
+            <w:pPr>
+              <w:pStyle w:val="TableContents"/>
+              <w:bidi w:val="0"/>
+              <w:spacing w:before="0" w:after="135"/>
+              <w:jc w:val="start"/>
+              <w:rPr/>
+            </w:pPr>
+            <w:r>
+              <w:rPr/>
+              <w:t>Monthly fees, receipts, reminders, and pending dues</w:t>
+            </w:r>
+          </w:p>
+        </w:tc>
+        <w:tc>
+          <w:tcPr>
+            <w:tcW w:w="4279" w:type="dxa"/>
+            <w:tcBorders/>
+            <w:vAlign w:val="center"/>
+          </w:tcPr>
+          <w:p>
+            <w:pPr>
+              <w:pStyle w:val="TableContents"/>
+              <w:bidi w:val="0"/>
+              <w:spacing w:before="0" w:after="135"/>
+              <w:jc w:val="start"/>
+              <w:rPr/>
+            </w:pPr>
+            <w:r>
+              <w:rPr/>
+              <w:t>Fee record, transaction, receipt, and reminder components</w:t>
+            </w:r>
+          </w:p>
+        </w:tc>
+        <w:tc>
+          <w:tcPr>
+            <w:tcW w:w="5457" w:type="dxa"/>
+            <w:tcBorders/>
+            <w:vAlign w:val="center"/>
+          </w:tcPr>
+          <w:p>
+            <w:pPr>
+              <w:pStyle w:val="TableContents"/>
+              <w:bidi w:val="0"/>
+              <w:spacing w:before="0" w:after="135"/>
+              <w:jc w:val="start"/>
+              <w:rPr/>
+            </w:pPr>
+            <w:r>
+              <w:rPr/>
+              <w:t>9 payment/receipt operations with partial-payment and balance tests</w:t>
+            </w:r>
+          </w:p>
+        </w:tc>
+      </w:tr>
+      <w:tr>
+        <w:trPr/>
+        <w:tc>
+          <w:tcPr>
+            <w:tcW w:w="3899" w:type="dxa"/>
+            <w:tcBorders/>
+            <w:vAlign w:val="center"/>
+          </w:tcPr>
+          <w:p>
+            <w:pPr>
+              <w:pStyle w:val="TableContents"/>
+              <w:bidi w:val="0"/>
+              <w:spacing w:before="0" w:after="135"/>
+              <w:jc w:val="start"/>
+              <w:rPr/>
+            </w:pPr>
+            <w:r>
+              <w:rPr/>
+              <w:t>Announcements and seat-change requests</w:t>
+            </w:r>
+          </w:p>
+        </w:tc>
+        <w:tc>
+          <w:tcPr>
+            <w:tcW w:w="4279" w:type="dxa"/>
+            <w:tcBorders/>
+            <w:vAlign w:val="center"/>
+          </w:tcPr>
+          <w:p>
+            <w:pPr>
+              <w:pStyle w:val="TableContents"/>
+              <w:bidi w:val="0"/>
+              <w:spacing w:before="0" w:after="135"/>
+              <w:jc w:val="start"/>
+              <w:rPr/>
+            </w:pPr>
+            <w:r>
+              <w:rPr/>
+              <w:t>Owner lifecycle and student self-service components</w:t>
+            </w:r>
+          </w:p>
+        </w:tc>
+        <w:tc>
+          <w:tcPr>
+            <w:tcW w:w="5457" w:type="dxa"/>
+            <w:tcBorders/>
+            <w:vAlign w:val="center"/>
+          </w:tcPr>
+          <w:p>
+            <w:pPr>
+              <w:pStyle w:val="TableContents"/>
+              <w:bidi w:val="0"/>
+              <w:spacing w:before="0" w:after="135"/>
+              <w:jc w:val="start"/>
+              <w:rPr/>
+            </w:pPr>
+            <w:r>
+              <w:rPr/>
+              <w:t>13 announcement/request operations with role and lifecycle tests</w:t>
+            </w:r>
+          </w:p>
+        </w:tc>
+      </w:tr>
+      <w:tr>
+        <w:trPr/>
+        <w:tc>
+          <w:tcPr>
+            <w:tcW w:w="3899" w:type="dxa"/>
+            <w:tcBorders/>
+            <w:vAlign w:val="center"/>
+          </w:tcPr>
+          <w:p>
+            <w:pPr>
+              <w:pStyle w:val="TableContents"/>
+              <w:bidi w:val="0"/>
+              <w:spacing w:before="0" w:after="135"/>
+              <w:jc w:val="start"/>
+              <w:rPr/>
+            </w:pPr>
+            <w:r>
+              <w:rPr/>
+              <w:t>Dashboard and operational reports</w:t>
+            </w:r>
+          </w:p>
+        </w:tc>
+        <w:tc>
+          <w:tcPr>
+            <w:tcW w:w="4279" w:type="dxa"/>
+            <w:tcBorders/>
+            <w:vAlign w:val="center"/>
+          </w:tcPr>
+          <w:p>
+            <w:pPr>
+              <w:pStyle w:val="TableContents"/>
+              <w:bidi w:val="0"/>
+              <w:spacing w:before="0" w:after="135"/>
+              <w:jc w:val="start"/>
+              <w:rPr/>
+            </w:pPr>
+            <w:r>
+              <w:rPr/>
+              <w:t>Dashboard, reports, and analytics components</w:t>
+            </w:r>
+          </w:p>
+        </w:tc>
+        <w:tc>
+          <w:tcPr>
+            <w:tcW w:w="5457" w:type="dxa"/>
+            <w:tcBorders/>
+            <w:vAlign w:val="center"/>
+          </w:tcPr>
+          <w:p>
+            <w:pPr>
+              <w:pStyle w:val="TableContents"/>
+              <w:bidi w:val="0"/>
+              <w:spacing w:before="0" w:after="135"/>
+              <w:jc w:val="start"/>
+              <w:rPr/>
+            </w:pPr>
+            <w:r>
+              <w:rPr/>
+              <w:t>Database-backed report and dashboard APIs with reconciliation tests</w:t>
+            </w:r>
+          </w:p>
+        </w:tc>
+      </w:tr>
+    </w:tbl>
     <w:p>
       <w:pPr>
         <w:pStyle w:val="Heading3"/>
@@ -4608,7 +5048,7 @@
       </w:pPr>
       <w:r>
         <w:rPr/>
-        <w:t>Other defects found and resolved during Sprint 1</w:t>
+        <w:t>Other defects found and resolved during Milestone 3 API Sprint 1</w:t>
       </w:r>
     </w:p>
     <w:tbl>
@@ -6051,7 +6491,7 @@
       </w:pPr>
       <w:r>
         <w:rPr/>
-        <w:t>9. Plan for Sprint 2</w:t>
+        <w:t>9. Plan for Milestone 3 API Sprint 2 (Project Sprint 8)</w:t>
       </w:r>
     </w:p>
     <w:p>
@@ -6063,7 +6503,7 @@
       </w:pPr>
       <w:r>
         <w:rPr/>
-        <w:t xml:space="preserve">Several Milestone 4 vertical slices were completed early, including student self-service, seat-request review, receipts/reminders, and owner reports. Sprint 2 will focus on the remaining platform scope and release hardening. </w:t>
+        <w:t xml:space="preserve">Several Milestone 4 vertical slices were completed early, including student self-service, seat-request review, receipts/reminders, and owner reports. The next API sprint will focus on the remaining platform scope and release hardening while continuing the project schedule documented in Milestone 2. </w:t>
       </w:r>
     </w:p>
     <w:tbl>
@@ -6543,7 +6983,7 @@
       </w:pPr>
       <w:r>
         <w:rPr/>
-        <w:t>Known Sprint 2 risks</w:t>
+        <w:t>Known next-sprint risks</w:t>
       </w:r>
     </w:p>
     <w:p>

</xml_diff>